<commit_message>
Bego en vez de Begonia, y noindex antes de publicar
</commit_message>
<xml_diff>
--- a/00-Plan-de-estudio.docx
+++ b/00-Plan-de-estudio.docx
@@ -2,7 +2,7 @@
 <file path=word/document.xml><?xml version="1.0" encoding="utf-8"?>
 <w:document xmlns:w="http://schemas.openxmlformats.org/wordprocessingml/2006/main" xmlns:m="http://schemas.openxmlformats.org/officeDocument/2006/math" xmlns:r="http://schemas.openxmlformats.org/officeDocument/2006/relationships" xmlns:o="urn:schemas-microsoft-com:office:office" xmlns:v="urn:schemas-microsoft-com:vml" xmlns:w10="urn:schemas-microsoft-com:office:word" xmlns:a="http://schemas.openxmlformats.org/drawingml/2006/main" xmlns:pic="http://schemas.openxmlformats.org/drawingml/2006/picture" xmlns:wp="http://schemas.openxmlformats.org/drawingml/2006/wordprocessingDrawing">
   <w:body>
-    <w:bookmarkStart w:id="28" w:name="plan-de-estudio-de-tres-semanas"/>
+    <w:bookmarkStart w:id="17" w:name="plan-de-estudio-de-tres-semanas"/>
     <w:p>
       <w:pPr>
         <w:pStyle w:val="Heading1"/>
@@ -17,10 +17,10 @@
       </w:pPr>
       <w:r>
         <w:rPr>
+          <w:b/>
           <w:bCs/>
-          <w:b/>
         </w:rPr>
-        <w:t xml:space="preserve">Begonia · 5° básico · Repaso marzo–septiembre 2026</w:t>
+        <w:t xml:space="preserve">Bego · 5° básico · Repaso marzo–septiembre 2026</w:t>
       </w:r>
     </w:p>
     <w:p>
@@ -28,7 +28,7 @@
         <w:pStyle w:val="BodyText"/>
       </w:pPr>
       <w:r>
-        <w:t xml:space="preserve">Este plan organiza el repaso de las cinco asignaturas que Begonia ha trabajado durante el primer semestre, siguiendo las Bases Curriculares del Ministerio de Educación de Chile para 5° básico.</w:t>
+        <w:t xml:space="preserve">Este plan organiza el repaso de las cinco asignaturas que Bego ha trabajado durante el primer semestre, siguiendo las Bases Curriculares del Ministerio de Educación de Chile para 5° básico.</w:t>
       </w:r>
     </w:p>
     <w:p>
@@ -37,8 +37,8 @@
       </w:pPr>
       <w:r>
         <w:rPr>
+          <w:b/>
           <w:bCs/>
-          <w:b/>
         </w:rPr>
         <w:t xml:space="preserve">Duración total estimada:</w:t>
       </w:r>
@@ -56,7 +56,7 @@
         </w:pict>
       </w:r>
     </w:p>
-    <w:bookmarkStart w:id="20" w:name="cómo-funciona"/>
+    <w:bookmarkStart w:id="9" w:name="cómo-funciona"/>
     <w:p>
       <w:pPr>
         <w:pStyle w:val="Heading2"/>
@@ -77,8 +77,8 @@
       <w:tblPr>
         <w:tblStyle w:val="Table"/>
         <w:tblW w:type="pct" w:w="5000"/>
+        <w:tblLayout w:type="fixed"/>
         <w:tblLook w:firstRow="1" w:lastRow="0" w:firstColumn="0" w:lastColumn="0" w:noHBand="0" w:noVBand="0" w:val="0020"/>
-        <w:jc w:val="start"/>
       </w:tblPr>
       <w:tblGrid>
         <w:gridCol w:w="2640"/>
@@ -87,14 +87,13 @@
       </w:tblGrid>
       <w:tr>
         <w:trPr>
-          <w:tblHeader w:val="true"/>
+          <w:tblHeader w:val="on"/>
         </w:trPr>
         <w:tc>
           <w:tcPr/>
           <w:p>
             <w:pPr>
               <w:pStyle w:val="Compact"/>
-              <w:jc w:val="left"/>
             </w:pPr>
             <w:r>
               <w:t xml:space="preserve">Semana</w:t>
@@ -106,7 +105,6 @@
           <w:p>
             <w:pPr>
               <w:pStyle w:val="Compact"/>
-              <w:jc w:val="left"/>
             </w:pPr>
             <w:r>
               <w:t xml:space="preserve">Etapa</w:t>
@@ -118,7 +116,6 @@
           <w:p>
             <w:pPr>
               <w:pStyle w:val="Compact"/>
-              <w:jc w:val="left"/>
             </w:pPr>
             <w:r>
               <w:t xml:space="preserve">Qué se hace</w:t>
@@ -132,7 +129,6 @@
           <w:p>
             <w:pPr>
               <w:pStyle w:val="Compact"/>
-              <w:jc w:val="left"/>
             </w:pPr>
             <w:r>
               <w:t xml:space="preserve">1</w:t>
@@ -144,7 +140,6 @@
           <w:p>
             <w:pPr>
               <w:pStyle w:val="Compact"/>
-              <w:jc w:val="left"/>
             </w:pPr>
             <w:r>
               <w:t xml:space="preserve">Reconocer</w:t>
@@ -156,7 +151,6 @@
           <w:p>
             <w:pPr>
               <w:pStyle w:val="Compact"/>
-              <w:jc w:val="left"/>
             </w:pPr>
             <w:r>
               <w:t xml:space="preserve">Diagnósticos de entrada y contenidos base de cada guía. Se identifica qué está sólido y qué necesita refuerzo.</w:t>
@@ -170,7 +164,6 @@
           <w:p>
             <w:pPr>
               <w:pStyle w:val="Compact"/>
-              <w:jc w:val="left"/>
             </w:pPr>
             <w:r>
               <w:t xml:space="preserve">2</w:t>
@@ -182,7 +175,6 @@
           <w:p>
             <w:pPr>
               <w:pStyle w:val="Compact"/>
-              <w:jc w:val="left"/>
             </w:pPr>
             <w:r>
               <w:t xml:space="preserve">Profundizar</w:t>
@@ -194,7 +186,6 @@
           <w:p>
             <w:pPr>
               <w:pStyle w:val="Compact"/>
-              <w:jc w:val="left"/>
             </w:pPr>
             <w:r>
               <w:t xml:space="preserve">Ejercicios graduados y actividades centrales. Se aplica lo aprendido en tareas más largas.</w:t>
@@ -208,7 +199,6 @@
           <w:p>
             <w:pPr>
               <w:pStyle w:val="Compact"/>
-              <w:jc w:val="left"/>
             </w:pPr>
             <w:r>
               <w:t xml:space="preserve">3</w:t>
@@ -220,7 +210,6 @@
           <w:p>
             <w:pPr>
               <w:pStyle w:val="Compact"/>
-              <w:jc w:val="left"/>
             </w:pPr>
             <w:r>
               <w:t xml:space="preserve">Consolidar</w:t>
@@ -232,7 +221,6 @@
           <w:p>
             <w:pPr>
               <w:pStyle w:val="Compact"/>
-              <w:jc w:val="left"/>
             </w:pPr>
             <w:r>
               <w:t xml:space="preserve">Repaso de los puntos débiles detectados y evaluación final integrada.</w:t>
@@ -253,8 +241,8 @@
       </w:r>
       <w:r>
         <w:rPr>
+          <w:b/>
           <w:bCs/>
-          <w:b/>
         </w:rPr>
         <w:t xml:space="preserve">solucionario para el adulto</w:t>
       </w:r>
@@ -262,7 +250,7 @@
         <w:t xml:space="preserve"> </w:t>
       </w:r>
       <w:r>
-        <w:t xml:space="preserve">al final, después de un salto de página, para que Begonia pueda trabajar sin ver las respuestas.</w:t>
+        <w:t xml:space="preserve">al final, después de un salto de página, para que Bego pueda trabajar sin ver las respuestas.</w:t>
       </w:r>
     </w:p>
     <w:p>
@@ -272,8 +260,8 @@
         </w:pict>
       </w:r>
     </w:p>
-    <w:bookmarkEnd w:id="20"/>
-    <w:bookmarkStart w:id="21" w:name="las-cinco-guías"/>
+    <w:bookmarkEnd w:id="9"/>
+    <w:bookmarkStart w:id="10" w:name="las-cinco-guías"/>
     <w:p>
       <w:pPr>
         <w:pStyle w:val="Heading2"/>
@@ -286,8 +274,8 @@
       <w:tblPr>
         <w:tblStyle w:val="Table"/>
         <w:tblW w:type="pct" w:w="5000"/>
+        <w:tblLayout w:type="fixed"/>
         <w:tblLook w:firstRow="1" w:lastRow="0" w:firstColumn="0" w:lastColumn="0" w:noHBand="0" w:noVBand="0" w:val="0020"/>
-        <w:jc w:val="start"/>
       </w:tblPr>
       <w:tblGrid>
         <w:gridCol w:w="1980"/>
@@ -297,14 +285,13 @@
       </w:tblGrid>
       <w:tr>
         <w:trPr>
-          <w:tblHeader w:val="true"/>
+          <w:tblHeader w:val="on"/>
         </w:trPr>
         <w:tc>
           <w:tcPr/>
           <w:p>
             <w:pPr>
               <w:pStyle w:val="Compact"/>
-              <w:jc w:val="left"/>
             </w:pPr>
             <w:r>
               <w:t xml:space="preserve">Guía</w:t>
@@ -316,7 +303,6 @@
           <w:p>
             <w:pPr>
               <w:pStyle w:val="Compact"/>
-              <w:jc w:val="left"/>
             </w:pPr>
             <w:r>
               <w:t xml:space="preserve">Asignatura</w:t>
@@ -328,7 +314,6 @@
           <w:p>
             <w:pPr>
               <w:pStyle w:val="Compact"/>
-              <w:jc w:val="left"/>
             </w:pPr>
             <w:r>
               <w:t xml:space="preserve">Contenidos</w:t>
@@ -340,7 +325,6 @@
           <w:p>
             <w:pPr>
               <w:pStyle w:val="Compact"/>
-              <w:jc w:val="left"/>
             </w:pPr>
             <w:r>
               <w:t xml:space="preserve">Horas</w:t>
@@ -354,7 +338,6 @@
           <w:p>
             <w:pPr>
               <w:pStyle w:val="Compact"/>
-              <w:jc w:val="left"/>
             </w:pPr>
             <w:r>
               <w:t xml:space="preserve">1</w:t>
@@ -366,7 +349,6 @@
           <w:p>
             <w:pPr>
               <w:pStyle w:val="Compact"/>
-              <w:jc w:val="left"/>
             </w:pPr>
             <w:r>
               <w:t xml:space="preserve">Matemáticas</w:t>
@@ -378,7 +360,6 @@
           <w:p>
             <w:pPr>
               <w:pStyle w:val="Compact"/>
-              <w:jc w:val="left"/>
             </w:pPr>
             <w:r>
               <w:t xml:space="preserve">Números hasta el millón, multiplicación y división, fracciones y decimales</w:t>
@@ -390,7 +371,6 @@
           <w:p>
             <w:pPr>
               <w:pStyle w:val="Compact"/>
-              <w:jc w:val="left"/>
             </w:pPr>
             <w:r>
               <w:t xml:space="preserve">5 h</w:t>
@@ -404,7 +384,6 @@
           <w:p>
             <w:pPr>
               <w:pStyle w:val="Compact"/>
-              <w:jc w:val="left"/>
             </w:pPr>
             <w:r>
               <w:t xml:space="preserve">2</w:t>
@@ -416,7 +395,6 @@
           <w:p>
             <w:pPr>
               <w:pStyle w:val="Compact"/>
-              <w:jc w:val="left"/>
             </w:pPr>
             <w:r>
               <w:t xml:space="preserve">Lenguaje y Comunicación</w:t>
@@ -428,7 +406,6 @@
           <w:p>
             <w:pPr>
               <w:pStyle w:val="Compact"/>
-              <w:jc w:val="left"/>
             </w:pPr>
             <w:r>
               <w:t xml:space="preserve">Textos literarios, el poema y sus elementos, lenguaje figurado</w:t>
@@ -440,7 +417,6 @@
           <w:p>
             <w:pPr>
               <w:pStyle w:val="Compact"/>
-              <w:jc w:val="left"/>
             </w:pPr>
             <w:r>
               <w:t xml:space="preserve">4 h</w:t>
@@ -454,7 +430,6 @@
           <w:p>
             <w:pPr>
               <w:pStyle w:val="Compact"/>
-              <w:jc w:val="left"/>
             </w:pPr>
             <w:r>
               <w:t xml:space="preserve">3</w:t>
@@ -466,7 +441,6 @@
           <w:p>
             <w:pPr>
               <w:pStyle w:val="Compact"/>
-              <w:jc w:val="left"/>
             </w:pPr>
             <w:r>
               <w:t xml:space="preserve">Ciencias Naturales</w:t>
@@ -478,7 +452,6 @@
           <w:p>
             <w:pPr>
               <w:pStyle w:val="Compact"/>
-              <w:jc w:val="left"/>
             </w:pPr>
             <w:r>
               <w:t xml:space="preserve">Hábitos de vida saludable, menú saludable, efectos del cigarrillo</w:t>
@@ -490,7 +463,6 @@
           <w:p>
             <w:pPr>
               <w:pStyle w:val="Compact"/>
-              <w:jc w:val="left"/>
             </w:pPr>
             <w:r>
               <w:t xml:space="preserve">4 h</w:t>
@@ -504,7 +476,6 @@
           <w:p>
             <w:pPr>
               <w:pStyle w:val="Compact"/>
-              <w:jc w:val="left"/>
             </w:pPr>
             <w:r>
               <w:t xml:space="preserve">4</w:t>
@@ -516,7 +487,6 @@
           <w:p>
             <w:pPr>
               <w:pStyle w:val="Compact"/>
-              <w:jc w:val="left"/>
             </w:pPr>
             <w:r>
               <w:t xml:space="preserve">Historia, Geografía y Cs. Sociales</w:t>
@@ -528,7 +498,6 @@
           <w:p>
             <w:pPr>
               <w:pStyle w:val="Compact"/>
-              <w:jc w:val="left"/>
             </w:pPr>
             <w:r>
               <w:t xml:space="preserve">Descubrimiento y Conquista de América</w:t>
@@ -540,7 +509,6 @@
           <w:p>
             <w:pPr>
               <w:pStyle w:val="Compact"/>
-              <w:jc w:val="left"/>
             </w:pPr>
             <w:r>
               <w:t xml:space="preserve">4 h</w:t>
@@ -554,7 +522,6 @@
           <w:p>
             <w:pPr>
               <w:pStyle w:val="Compact"/>
-              <w:jc w:val="left"/>
             </w:pPr>
             <w:r>
               <w:t xml:space="preserve">5</w:t>
@@ -566,7 +533,6 @@
           <w:p>
             <w:pPr>
               <w:pStyle w:val="Compact"/>
-              <w:jc w:val="left"/>
             </w:pPr>
             <w:r>
               <w:t xml:space="preserve">Inglés</w:t>
@@ -578,7 +544,6 @@
           <w:p>
             <w:pPr>
               <w:pStyle w:val="Compact"/>
-              <w:jc w:val="left"/>
             </w:pPr>
             <w:r>
               <w:t xml:space="preserve">Food vocabulary and healthy habits</w:t>
@@ -590,7 +555,6 @@
           <w:p>
             <w:pPr>
               <w:pStyle w:val="Compact"/>
-              <w:jc w:val="left"/>
             </w:pPr>
             <w:r>
               <w:t xml:space="preserve">3 h</w:t>
@@ -606,8 +570,8 @@
         </w:pict>
       </w:r>
     </w:p>
-    <w:bookmarkEnd w:id="21"/>
-    <w:bookmarkStart w:id="25" w:name="calendario-sugerido"/>
+    <w:bookmarkEnd w:id="10"/>
+    <w:bookmarkStart w:id="14" w:name="calendario-sugerido"/>
     <w:p>
       <w:pPr>
         <w:pStyle w:val="Heading2"/>
@@ -616,7 +580,7 @@
         <w:t xml:space="preserve">Calendario sugerido</w:t>
       </w:r>
     </w:p>
-    <w:bookmarkStart w:id="22" w:name="semana-1-reconocer"/>
+    <w:bookmarkStart w:id="11" w:name="semana-1-reconocer"/>
     <w:p>
       <w:pPr>
         <w:pStyle w:val="Heading3"/>
@@ -629,8 +593,8 @@
       <w:tblPr>
         <w:tblStyle w:val="Table"/>
         <w:tblW w:type="pct" w:w="5000"/>
+        <w:tblLayout w:type="fixed"/>
         <w:tblLook w:firstRow="1" w:lastRow="0" w:firstColumn="0" w:lastColumn="0" w:noHBand="0" w:noVBand="0" w:val="0020"/>
-        <w:jc w:val="start"/>
       </w:tblPr>
       <w:tblGrid>
         <w:gridCol w:w="2640"/>
@@ -639,14 +603,13 @@
       </w:tblGrid>
       <w:tr>
         <w:trPr>
-          <w:tblHeader w:val="true"/>
+          <w:tblHeader w:val="on"/>
         </w:trPr>
         <w:tc>
           <w:tcPr/>
           <w:p>
             <w:pPr>
               <w:pStyle w:val="Compact"/>
-              <w:jc w:val="left"/>
             </w:pPr>
             <w:r>
               <w:t xml:space="preserve">Sesión</w:t>
@@ -658,7 +621,6 @@
           <w:p>
             <w:pPr>
               <w:pStyle w:val="Compact"/>
-              <w:jc w:val="left"/>
             </w:pPr>
             <w:r>
               <w:t xml:space="preserve">Duración</w:t>
@@ -670,7 +632,6 @@
           <w:p>
             <w:pPr>
               <w:pStyle w:val="Compact"/>
-              <w:jc w:val="left"/>
             </w:pPr>
             <w:r>
               <w:t xml:space="preserve">Actividad</w:t>
@@ -684,7 +645,6 @@
           <w:p>
             <w:pPr>
               <w:pStyle w:val="Compact"/>
-              <w:jc w:val="left"/>
             </w:pPr>
             <w:r>
               <w:t xml:space="preserve">1</w:t>
@@ -696,7 +656,6 @@
           <w:p>
             <w:pPr>
               <w:pStyle w:val="Compact"/>
-              <w:jc w:val="left"/>
             </w:pPr>
             <w:r>
               <w:t xml:space="preserve">60 min</w:t>
@@ -708,7 +667,6 @@
           <w:p>
             <w:pPr>
               <w:pStyle w:val="Compact"/>
-              <w:jc w:val="left"/>
             </w:pPr>
             <w:r>
               <w:t xml:space="preserve">Matemáticas: diagnóstico + Secciones 1 y 2 (números y operaciones)</w:t>
@@ -722,7 +680,6 @@
           <w:p>
             <w:pPr>
               <w:pStyle w:val="Compact"/>
-              <w:jc w:val="left"/>
             </w:pPr>
             <w:r>
               <w:t xml:space="preserve">2</w:t>
@@ -734,7 +691,6 @@
           <w:p>
             <w:pPr>
               <w:pStyle w:val="Compact"/>
-              <w:jc w:val="left"/>
             </w:pPr>
             <w:r>
               <w:t xml:space="preserve">45 min</w:t>
@@ -746,7 +702,6 @@
           <w:p>
             <w:pPr>
               <w:pStyle w:val="Compact"/>
-              <w:jc w:val="left"/>
             </w:pPr>
             <w:r>
               <w:t xml:space="preserve">Lenguaje: diagnóstico + Sección 1 (textos literarios)</w:t>
@@ -760,7 +715,6 @@
           <w:p>
             <w:pPr>
               <w:pStyle w:val="Compact"/>
-              <w:jc w:val="left"/>
             </w:pPr>
             <w:r>
               <w:t xml:space="preserve">3</w:t>
@@ -772,7 +726,6 @@
           <w:p>
             <w:pPr>
               <w:pStyle w:val="Compact"/>
-              <w:jc w:val="left"/>
             </w:pPr>
             <w:r>
               <w:t xml:space="preserve">45 min</w:t>
@@ -784,7 +737,6 @@
           <w:p>
             <w:pPr>
               <w:pStyle w:val="Compact"/>
-              <w:jc w:val="left"/>
             </w:pPr>
             <w:r>
               <w:t xml:space="preserve">Ciencias: diagnóstico + Sección 1 (hábitos saludables)</w:t>
@@ -798,7 +750,6 @@
           <w:p>
             <w:pPr>
               <w:pStyle w:val="Compact"/>
-              <w:jc w:val="left"/>
             </w:pPr>
             <w:r>
               <w:t xml:space="preserve">4</w:t>
@@ -810,7 +761,6 @@
           <w:p>
             <w:pPr>
               <w:pStyle w:val="Compact"/>
-              <w:jc w:val="left"/>
             </w:pPr>
             <w:r>
               <w:t xml:space="preserve">45 min</w:t>
@@ -822,7 +772,6 @@
           <w:p>
             <w:pPr>
               <w:pStyle w:val="Compact"/>
-              <w:jc w:val="left"/>
             </w:pPr>
             <w:r>
               <w:t xml:space="preserve">Historia: diagnóstico + Sección 1 (el mundo antes de 1492)</w:t>
@@ -836,7 +785,6 @@
           <w:p>
             <w:pPr>
               <w:pStyle w:val="Compact"/>
-              <w:jc w:val="left"/>
             </w:pPr>
             <w:r>
               <w:t xml:space="preserve">5</w:t>
@@ -848,7 +796,6 @@
           <w:p>
             <w:pPr>
               <w:pStyle w:val="Compact"/>
-              <w:jc w:val="left"/>
             </w:pPr>
             <w:r>
               <w:t xml:space="preserve">45 min</w:t>
@@ -860,7 +807,6 @@
           <w:p>
             <w:pPr>
               <w:pStyle w:val="Compact"/>
-              <w:jc w:val="left"/>
             </w:pPr>
             <w:r>
               <w:t xml:space="preserve">Inglés: diagnóstico + Section 1 (food vocabulary)</w:t>
@@ -869,8 +815,8 @@
         </w:tc>
       </w:tr>
     </w:tbl>
-    <w:bookmarkEnd w:id="22"/>
-    <w:bookmarkStart w:id="23" w:name="semana-2-profundizar"/>
+    <w:bookmarkEnd w:id="11"/>
+    <w:bookmarkStart w:id="12" w:name="semana-2-profundizar"/>
     <w:p>
       <w:pPr>
         <w:pStyle w:val="Heading3"/>
@@ -883,8 +829,8 @@
       <w:tblPr>
         <w:tblStyle w:val="Table"/>
         <w:tblW w:type="pct" w:w="5000"/>
+        <w:tblLayout w:type="fixed"/>
         <w:tblLook w:firstRow="1" w:lastRow="0" w:firstColumn="0" w:lastColumn="0" w:noHBand="0" w:noVBand="0" w:val="0020"/>
-        <w:jc w:val="start"/>
       </w:tblPr>
       <w:tblGrid>
         <w:gridCol w:w="2640"/>
@@ -893,14 +839,13 @@
       </w:tblGrid>
       <w:tr>
         <w:trPr>
-          <w:tblHeader w:val="true"/>
+          <w:tblHeader w:val="on"/>
         </w:trPr>
         <w:tc>
           <w:tcPr/>
           <w:p>
             <w:pPr>
               <w:pStyle w:val="Compact"/>
-              <w:jc w:val="left"/>
             </w:pPr>
             <w:r>
               <w:t xml:space="preserve">Sesión</w:t>
@@ -912,7 +857,6 @@
           <w:p>
             <w:pPr>
               <w:pStyle w:val="Compact"/>
-              <w:jc w:val="left"/>
             </w:pPr>
             <w:r>
               <w:t xml:space="preserve">Duración</w:t>
@@ -924,7 +868,6 @@
           <w:p>
             <w:pPr>
               <w:pStyle w:val="Compact"/>
-              <w:jc w:val="left"/>
             </w:pPr>
             <w:r>
               <w:t xml:space="preserve">Actividad</w:t>
@@ -938,7 +881,6 @@
           <w:p>
             <w:pPr>
               <w:pStyle w:val="Compact"/>
-              <w:jc w:val="left"/>
             </w:pPr>
             <w:r>
               <w:t xml:space="preserve">6</w:t>
@@ -950,7 +892,6 @@
           <w:p>
             <w:pPr>
               <w:pStyle w:val="Compact"/>
-              <w:jc w:val="left"/>
             </w:pPr>
             <w:r>
               <w:t xml:space="preserve">60 min</w:t>
@@ -962,7 +903,6 @@
           <w:p>
             <w:pPr>
               <w:pStyle w:val="Compact"/>
-              <w:jc w:val="left"/>
             </w:pPr>
             <w:r>
               <w:t xml:space="preserve">Matemáticas: Secciones 3 y 4 (fracciones y decimales)</w:t>
@@ -976,7 +916,6 @@
           <w:p>
             <w:pPr>
               <w:pStyle w:val="Compact"/>
-              <w:jc w:val="left"/>
             </w:pPr>
             <w:r>
               <w:t xml:space="preserve">7</w:t>
@@ -988,7 +927,6 @@
           <w:p>
             <w:pPr>
               <w:pStyle w:val="Compact"/>
-              <w:jc w:val="left"/>
             </w:pPr>
             <w:r>
               <w:t xml:space="preserve">60 min</w:t>
@@ -1000,7 +938,6 @@
           <w:p>
             <w:pPr>
               <w:pStyle w:val="Compact"/>
-              <w:jc w:val="left"/>
             </w:pPr>
             <w:r>
               <w:t xml:space="preserve">Matemáticas: práctica graduada + actividad central</w:t>
@@ -1014,7 +951,6 @@
           <w:p>
             <w:pPr>
               <w:pStyle w:val="Compact"/>
-              <w:jc w:val="left"/>
             </w:pPr>
             <w:r>
               <w:t xml:space="preserve">8</w:t>
@@ -1026,7 +962,6 @@
           <w:p>
             <w:pPr>
               <w:pStyle w:val="Compact"/>
-              <w:jc w:val="left"/>
             </w:pPr>
             <w:r>
               <w:t xml:space="preserve">60 min</w:t>
@@ -1038,7 +973,6 @@
           <w:p>
             <w:pPr>
               <w:pStyle w:val="Compact"/>
-              <w:jc w:val="left"/>
             </w:pPr>
             <w:r>
               <w:t xml:space="preserve">Lenguaje: Secciones 2 y 3 (el poema, lenguaje figurado) + actividad central</w:t>
@@ -1052,7 +986,6 @@
           <w:p>
             <w:pPr>
               <w:pStyle w:val="Compact"/>
-              <w:jc w:val="left"/>
             </w:pPr>
             <w:r>
               <w:t xml:space="preserve">9</w:t>
@@ -1064,7 +997,6 @@
           <w:p>
             <w:pPr>
               <w:pStyle w:val="Compact"/>
-              <w:jc w:val="left"/>
             </w:pPr>
             <w:r>
               <w:t xml:space="preserve">60 min</w:t>
@@ -1076,7 +1008,6 @@
           <w:p>
             <w:pPr>
               <w:pStyle w:val="Compact"/>
-              <w:jc w:val="left"/>
             </w:pPr>
             <w:r>
               <w:t xml:space="preserve">Ciencias: Secciones 2 y 3 (menú saludable, cigarrillo) + actividad central</w:t>
@@ -1090,7 +1021,6 @@
           <w:p>
             <w:pPr>
               <w:pStyle w:val="Compact"/>
-              <w:jc w:val="left"/>
             </w:pPr>
             <w:r>
               <w:t xml:space="preserve">10</w:t>
@@ -1102,7 +1032,6 @@
           <w:p>
             <w:pPr>
               <w:pStyle w:val="Compact"/>
-              <w:jc w:val="left"/>
             </w:pPr>
             <w:r>
               <w:t xml:space="preserve">60 min</w:t>
@@ -1114,7 +1043,6 @@
           <w:p>
             <w:pPr>
               <w:pStyle w:val="Compact"/>
-              <w:jc w:val="left"/>
             </w:pPr>
             <w:r>
               <w:t xml:space="preserve">Historia: Secciones 2 y 3 (viajes y conquista) + actividad central</w:t>
@@ -1123,8 +1051,8 @@
         </w:tc>
       </w:tr>
     </w:tbl>
-    <w:bookmarkEnd w:id="23"/>
-    <w:bookmarkStart w:id="24" w:name="semana-3-consolidar"/>
+    <w:bookmarkEnd w:id="12"/>
+    <w:bookmarkStart w:id="13" w:name="semana-3-consolidar"/>
     <w:p>
       <w:pPr>
         <w:pStyle w:val="Heading3"/>
@@ -1137,8 +1065,8 @@
       <w:tblPr>
         <w:tblStyle w:val="Table"/>
         <w:tblW w:type="pct" w:w="5000"/>
+        <w:tblLayout w:type="fixed"/>
         <w:tblLook w:firstRow="1" w:lastRow="0" w:firstColumn="0" w:lastColumn="0" w:noHBand="0" w:noVBand="0" w:val="0020"/>
-        <w:jc w:val="start"/>
       </w:tblPr>
       <w:tblGrid>
         <w:gridCol w:w="2640"/>
@@ -1147,14 +1075,13 @@
       </w:tblGrid>
       <w:tr>
         <w:trPr>
-          <w:tblHeader w:val="true"/>
+          <w:tblHeader w:val="on"/>
         </w:trPr>
         <w:tc>
           <w:tcPr/>
           <w:p>
             <w:pPr>
               <w:pStyle w:val="Compact"/>
-              <w:jc w:val="left"/>
             </w:pPr>
             <w:r>
               <w:t xml:space="preserve">Sesión</w:t>
@@ -1166,7 +1093,6 @@
           <w:p>
             <w:pPr>
               <w:pStyle w:val="Compact"/>
-              <w:jc w:val="left"/>
             </w:pPr>
             <w:r>
               <w:t xml:space="preserve">Duración</w:t>
@@ -1178,7 +1104,6 @@
           <w:p>
             <w:pPr>
               <w:pStyle w:val="Compact"/>
-              <w:jc w:val="left"/>
             </w:pPr>
             <w:r>
               <w:t xml:space="preserve">Actividad</w:t>
@@ -1192,7 +1117,6 @@
           <w:p>
             <w:pPr>
               <w:pStyle w:val="Compact"/>
-              <w:jc w:val="left"/>
             </w:pPr>
             <w:r>
               <w:t xml:space="preserve">11</w:t>
@@ -1204,7 +1128,6 @@
           <w:p>
             <w:pPr>
               <w:pStyle w:val="Compact"/>
-              <w:jc w:val="left"/>
             </w:pPr>
             <w:r>
               <w:t xml:space="preserve">45 min</w:t>
@@ -1216,7 +1139,6 @@
           <w:p>
             <w:pPr>
               <w:pStyle w:val="Compact"/>
-              <w:jc w:val="left"/>
             </w:pPr>
             <w:r>
               <w:t xml:space="preserve">Inglés: Sections 2 y 3 + final task</w:t>
@@ -1230,7 +1152,6 @@
           <w:p>
             <w:pPr>
               <w:pStyle w:val="Compact"/>
-              <w:jc w:val="left"/>
             </w:pPr>
             <w:r>
               <w:t xml:space="preserve">12</w:t>
@@ -1242,7 +1163,6 @@
           <w:p>
             <w:pPr>
               <w:pStyle w:val="Compact"/>
-              <w:jc w:val="left"/>
             </w:pPr>
             <w:r>
               <w:t xml:space="preserve">45 min</w:t>
@@ -1254,7 +1174,6 @@
           <w:p>
             <w:pPr>
               <w:pStyle w:val="Compact"/>
-              <w:jc w:val="left"/>
             </w:pPr>
             <w:r>
               <w:t xml:space="preserve">Repaso libre de los puntos marcados en las tablas de remediación</w:t>
@@ -1268,7 +1187,6 @@
           <w:p>
             <w:pPr>
               <w:pStyle w:val="Compact"/>
-              <w:jc w:val="left"/>
             </w:pPr>
             <w:r>
               <w:t xml:space="preserve">13</w:t>
@@ -1280,7 +1198,6 @@
           <w:p>
             <w:pPr>
               <w:pStyle w:val="Compact"/>
-              <w:jc w:val="left"/>
             </w:pPr>
             <w:r>
               <w:t xml:space="preserve">45 min</w:t>
@@ -1292,7 +1209,6 @@
           <w:p>
             <w:pPr>
               <w:pStyle w:val="Compact"/>
-              <w:jc w:val="left"/>
             </w:pPr>
             <w:r>
               <w:t xml:space="preserve">Evaluación integradora de cada guía (las que queden pendientes)</w:t>
@@ -1306,7 +1222,6 @@
           <w:p>
             <w:pPr>
               <w:pStyle w:val="Compact"/>
-              <w:jc w:val="left"/>
             </w:pPr>
             <w:r>
               <w:t xml:space="preserve">14</w:t>
@@ -1318,7 +1233,6 @@
           <w:p>
             <w:pPr>
               <w:pStyle w:val="Compact"/>
-              <w:jc w:val="left"/>
             </w:pPr>
             <w:r>
               <w:t xml:space="preserve">60 min</w:t>
@@ -1330,7 +1244,6 @@
           <w:p>
             <w:pPr>
               <w:pStyle w:val="Compact"/>
-              <w:jc w:val="left"/>
             </w:pPr>
             <w:r>
               <w:t xml:space="preserve">Evaluación Final Integrada (documento 6)</w:t>
@@ -1344,7 +1257,6 @@
           <w:p>
             <w:pPr>
               <w:pStyle w:val="Compact"/>
-              <w:jc w:val="left"/>
             </w:pPr>
             <w:r>
               <w:t xml:space="preserve">15</w:t>
@@ -1356,7 +1268,6 @@
           <w:p>
             <w:pPr>
               <w:pStyle w:val="Compact"/>
-              <w:jc w:val="left"/>
             </w:pPr>
             <w:r>
               <w:t xml:space="preserve">30 min</w:t>
@@ -1368,7 +1279,6 @@
           <w:p>
             <w:pPr>
               <w:pStyle w:val="Compact"/>
-              <w:jc w:val="left"/>
             </w:pPr>
             <w:r>
               <w:t xml:space="preserve">Revisión de la evaluación final y cierre</w:t>
@@ -1384,9 +1294,9 @@
         </w:pict>
       </w:r>
     </w:p>
-    <w:bookmarkEnd w:id="24"/>
-    <w:bookmarkEnd w:id="25"/>
-    <w:bookmarkStart w:id="26" w:name="conexiones-entre-asignaturas"/>
+    <w:bookmarkEnd w:id="13"/>
+    <w:bookmarkEnd w:id="14"/>
+    <w:bookmarkStart w:id="15" w:name="conexiones-entre-asignaturas"/>
     <w:p>
       <w:pPr>
         <w:pStyle w:val="Heading2"/>
@@ -1405,11 +1315,11 @@
     </w:p>
     <w:p>
       <w:pPr>
+        <w:pStyle w:val="Compact"/>
         <w:numPr>
           <w:ilvl w:val="0"/>
           <w:numId w:val="1001"/>
         </w:numPr>
-        <w:pStyle w:val="Compact"/>
       </w:pPr>
       <w:r>
         <w:t xml:space="preserve">El</w:t>
@@ -1419,8 +1329,8 @@
       </w:r>
       <w:r>
         <w:rPr>
+          <w:b/>
           <w:bCs/>
-          <w:b/>
         </w:rPr>
         <w:t xml:space="preserve">menú saludable</w:t>
       </w:r>
@@ -1428,16 +1338,16 @@
         <w:t xml:space="preserve"> </w:t>
       </w:r>
       <w:r>
-        <w:t xml:space="preserve">que Begonia diseña en Ciencias se traduce al inglés en la guía 5.</w:t>
+        <w:t xml:space="preserve">que Bego diseña en Ciencias se traduce al inglés en la guía 5.</w:t>
       </w:r>
     </w:p>
     <w:p>
       <w:pPr>
+        <w:pStyle w:val="Compact"/>
         <w:numPr>
           <w:ilvl w:val="0"/>
           <w:numId w:val="1001"/>
         </w:numPr>
-        <w:pStyle w:val="Compact"/>
       </w:pPr>
       <w:r>
         <w:t xml:space="preserve">Las</w:t>
@@ -1447,8 +1357,8 @@
       </w:r>
       <w:r>
         <w:rPr>
+          <w:b/>
           <w:bCs/>
-          <w:b/>
         </w:rPr>
         <w:t xml:space="preserve">fracciones</w:t>
       </w:r>
@@ -1461,11 +1371,11 @@
     </w:p>
     <w:p>
       <w:pPr>
+        <w:pStyle w:val="Compact"/>
         <w:numPr>
           <w:ilvl w:val="0"/>
           <w:numId w:val="1001"/>
         </w:numPr>
-        <w:pStyle w:val="Compact"/>
       </w:pPr>
       <w:r>
         <w:t xml:space="preserve">Los</w:t>
@@ -1475,8 +1385,8 @@
       </w:r>
       <w:r>
         <w:rPr>
+          <w:b/>
           <w:bCs/>
-          <w:b/>
         </w:rPr>
         <w:t xml:space="preserve">viajes de Colón</w:t>
       </w:r>
@@ -1489,11 +1399,11 @@
     </w:p>
     <w:p>
       <w:pPr>
+        <w:pStyle w:val="Compact"/>
         <w:numPr>
           <w:ilvl w:val="0"/>
           <w:numId w:val="1001"/>
         </w:numPr>
-        <w:pStyle w:val="Compact"/>
       </w:pPr>
       <w:r>
         <w:t xml:space="preserve">El poema</w:t>
@@ -1503,24 +1413,10 @@
       </w:r>
       <w:r>
         <w:rPr>
+          <w:b/>
           <w:bCs/>
-          <w:b/>
         </w:rPr>
-        <w:t xml:space="preserve">“</w:t>
-      </w:r>
-      <w:r>
-        <w:rPr>
-          <w:bCs/>
-          <w:b/>
-        </w:rPr>
-        <w:t xml:space="preserve">Barco de papel</w:t>
-      </w:r>
-      <w:r>
-        <w:rPr>
-          <w:bCs/>
-          <w:b/>
-        </w:rPr>
-        <w:t xml:space="preserve">”</w:t>
+        <w:t xml:space="preserve">“Barco de papel”</w:t>
       </w:r>
       <w:r>
         <w:t xml:space="preserve"> </w:t>
@@ -1536,8 +1432,8 @@
         </w:pict>
       </w:r>
     </w:p>
-    <w:bookmarkEnd w:id="26"/>
-    <w:bookmarkStart w:id="27" w:name="X79977fd9259295fb18ae5bf414963fe242173ad"/>
+    <w:bookmarkEnd w:id="15"/>
+    <w:bookmarkStart w:id="16" w:name="X79977fd9259295fb18ae5bf414963fe242173ad"/>
     <w:p>
       <w:pPr>
         <w:pStyle w:val="Heading2"/>
@@ -1548,11 +1444,11 @@
     </w:p>
     <w:p>
       <w:pPr>
+        <w:pStyle w:val="Compact"/>
         <w:numPr>
           <w:ilvl w:val="0"/>
           <w:numId w:val="1002"/>
         </w:numPr>
-        <w:pStyle w:val="Compact"/>
       </w:pPr>
       <w:r>
         <w:t xml:space="preserve">Sesiones de 45 a 60 minutos, con una pausa a la mitad. Más tiempo seguido rinde menos.</w:t>
@@ -1560,23 +1456,23 @@
     </w:p>
     <w:p>
       <w:pPr>
+        <w:pStyle w:val="Compact"/>
         <w:numPr>
           <w:ilvl w:val="0"/>
           <w:numId w:val="1002"/>
         </w:numPr>
-        <w:pStyle w:val="Compact"/>
-      </w:pPr>
-      <w:r>
-        <w:t xml:space="preserve">Corregir junto a Begonia, no después. El error explicado en el momento es el que se aprende.</w:t>
+      </w:pPr>
+      <w:r>
+        <w:t xml:space="preserve">Corregir junto a Bego, no después. El error explicado en el momento es el que se aprende.</w:t>
       </w:r>
     </w:p>
     <w:p>
       <w:pPr>
+        <w:pStyle w:val="Compact"/>
         <w:numPr>
           <w:ilvl w:val="0"/>
           <w:numId w:val="1002"/>
         </w:numPr>
-        <w:pStyle w:val="Compact"/>
       </w:pPr>
       <w:r>
         <w:t xml:space="preserve">Las tablas de remediación al final de cada guía indican exactamente a qué sección volver según los errores.</w:t>
@@ -1584,19 +1480,23 @@
     </w:p>
     <w:p>
       <w:pPr>
+        <w:pStyle w:val="Compact"/>
         <w:numPr>
           <w:ilvl w:val="0"/>
           <w:numId w:val="1002"/>
         </w:numPr>
-        <w:pStyle w:val="Compact"/>
       </w:pPr>
       <w:r>
         <w:t xml:space="preserve">Si una sección resulta fácil, se puede saltar la práctica de nivel 1 e ir directo al nivel 2.</w:t>
       </w:r>
     </w:p>
-    <w:bookmarkEnd w:id="27"/>
-    <w:bookmarkEnd w:id="28"/>
-    <w:sectPr/>
+    <w:bookmarkEnd w:id="16"/>
+    <w:bookmarkEnd w:id="17"/>
+    <w:sectPr>
+      <w:footnotePr>
+        <w:numRestart w:val="eachSect"/>
+      </w:footnotePr>
+    </w:sectPr>
   </w:body>
 </w:document>
 </file>
@@ -1627,14 +1527,14 @@
 <file path=word/numbering.xml><?xml version="1.0" encoding="utf-8"?>
 <w:numbering xmlns:w="http://schemas.openxmlformats.org/wordprocessingml/2006/main">
   <w:abstractNum w:abstractNumId="990">
-    <w:nsid w:val="A990"/>
+    <w:nsid w:val="0000A990"/>
     <w:multiLevelType w:val="multilevel"/>
     <w:lvl w:ilvl="0">
       <w:numFmt w:val="bullet"/>
       <w:lvlText w:val=" "/>
       <w:lvlJc w:val="left"/>
       <w:pPr>
-        <w:ind w:left="720" w:hanging="480"/>
+        <w:ind w:left="720" w:hanging="360"/>
       </w:pPr>
     </w:lvl>
     <w:lvl w:ilvl="1">
@@ -1642,7 +1542,7 @@
       <w:lvlText w:val=" "/>
       <w:lvlJc w:val="left"/>
       <w:pPr>
-        <w:ind w:left="1440" w:hanging="480"/>
+        <w:ind w:left="1440" w:hanging="360"/>
       </w:pPr>
     </w:lvl>
     <w:lvl w:ilvl="2">
@@ -1650,7 +1550,7 @@
       <w:lvlText w:val=" "/>
       <w:lvlJc w:val="left"/>
       <w:pPr>
-        <w:ind w:left="2160" w:hanging="480"/>
+        <w:ind w:left="2160" w:hanging="360"/>
       </w:pPr>
     </w:lvl>
     <w:lvl w:ilvl="3">
@@ -1658,7 +1558,7 @@
       <w:lvlText w:val=" "/>
       <w:lvlJc w:val="left"/>
       <w:pPr>
-        <w:ind w:left="2880" w:hanging="480"/>
+        <w:ind w:left="2880" w:hanging="360"/>
       </w:pPr>
     </w:lvl>
     <w:lvl w:ilvl="4">
@@ -1666,7 +1566,7 @@
       <w:lvlText w:val=" "/>
       <w:lvlJc w:val="left"/>
       <w:pPr>
-        <w:ind w:left="3600" w:hanging="480"/>
+        <w:ind w:left="3600" w:hanging="360"/>
       </w:pPr>
     </w:lvl>
     <w:lvl w:ilvl="5">
@@ -1674,7 +1574,7 @@
       <w:lvlText w:val=" "/>
       <w:lvlJc w:val="left"/>
       <w:pPr>
-        <w:ind w:left="4320" w:hanging="480"/>
+        <w:ind w:left="4320" w:hanging="360"/>
       </w:pPr>
     </w:lvl>
     <w:lvl w:ilvl="6">
@@ -1682,7 +1582,7 @@
       <w:lvlText w:val=" "/>
       <w:lvlJc w:val="left"/>
       <w:pPr>
-        <w:ind w:left="5040" w:hanging="480"/>
+        <w:ind w:left="5040" w:hanging="360"/>
       </w:pPr>
     </w:lvl>
     <w:lvl w:ilvl="7">
@@ -1690,7 +1590,7 @@
       <w:lvlText w:val=" "/>
       <w:lvlJc w:val="left"/>
       <w:pPr>
-        <w:ind w:left="5760" w:hanging="480"/>
+        <w:ind w:left="5760" w:hanging="360"/>
       </w:pPr>
     </w:lvl>
     <w:lvl w:ilvl="8">
@@ -1698,84 +1598,111 @@
       <w:lvlText w:val=" "/>
       <w:lvlJc w:val="left"/>
       <w:pPr>
-        <w:ind w:left="6480" w:hanging="480"/>
+        <w:ind w:left="6480" w:hanging="360"/>
       </w:pPr>
     </w:lvl>
   </w:abstractNum>
   <w:abstractNum w:abstractNumId="991">
-    <w:nsid w:val="A991"/>
+    <w:nsid w:val="0000A991"/>
     <w:multiLevelType w:val="multilevel"/>
     <w:lvl w:ilvl="0">
       <w:numFmt w:val="bullet"/>
-      <w:lvlText w:val="•"/>
+      <w:lvlText w:val=""/>
       <w:lvlJc w:val="left"/>
       <w:pPr>
-        <w:ind w:left="720" w:hanging="480"/>
-      </w:pPr>
+        <w:ind w:left="720" w:hanging="360"/>
+      </w:pPr>
+      <w:rPr>
+        <w:rFonts w:ascii="Symbol" w:hAnsi="Symbol" w:cs="Symbol" w:hint="default"/>
+      </w:rPr>
     </w:lvl>
     <w:lvl w:ilvl="1">
       <w:numFmt w:val="bullet"/>
-      <w:lvlText w:val="–"/>
+      <w:lvlText w:val="o"/>
       <w:lvlJc w:val="left"/>
       <w:pPr>
-        <w:ind w:left="1440" w:hanging="480"/>
-      </w:pPr>
+        <w:ind w:left="1440" w:hanging="360"/>
+      </w:pPr>
+      <w:rPr>
+        <w:rFonts w:ascii="Courier New" w:hAnsi="Courier New" w:cs="Courier New" w:hint="default"/>
+      </w:rPr>
     </w:lvl>
     <w:lvl w:ilvl="2">
       <w:numFmt w:val="bullet"/>
-      <w:lvlText w:val="•"/>
+      <w:lvlText w:val=""/>
       <w:lvlJc w:val="left"/>
       <w:pPr>
-        <w:ind w:left="2160" w:hanging="480"/>
-      </w:pPr>
+        <w:ind w:left="2160" w:hanging="360"/>
+      </w:pPr>
+      <w:rPr>
+        <w:rFonts w:ascii="Wingdings" w:hAnsi="Wingdings" w:cs="Wingdings" w:hint="default"/>
+      </w:rPr>
     </w:lvl>
     <w:lvl w:ilvl="3">
       <w:numFmt w:val="bullet"/>
-      <w:lvlText w:val="–"/>
+      <w:lvlText w:val=""/>
       <w:lvlJc w:val="left"/>
       <w:pPr>
-        <w:ind w:left="2880" w:hanging="480"/>
-      </w:pPr>
+        <w:ind w:left="2880" w:hanging="360"/>
+      </w:pPr>
+      <w:rPr>
+        <w:rFonts w:ascii="Symbol" w:hAnsi="Symbol" w:cs="Symbol" w:hint="default"/>
+      </w:rPr>
     </w:lvl>
     <w:lvl w:ilvl="4">
       <w:numFmt w:val="bullet"/>
-      <w:lvlText w:val="•"/>
+      <w:lvlText w:val="o"/>
       <w:lvlJc w:val="left"/>
       <w:pPr>
-        <w:ind w:left="3600" w:hanging="480"/>
-      </w:pPr>
+        <w:ind w:left="3600" w:hanging="360"/>
+      </w:pPr>
+      <w:rPr>
+        <w:rFonts w:ascii="Courier New" w:hAnsi="Courier New" w:cs="Courier New" w:hint="default"/>
+      </w:rPr>
     </w:lvl>
     <w:lvl w:ilvl="5">
       <w:numFmt w:val="bullet"/>
-      <w:lvlText w:val="–"/>
+      <w:lvlText w:val=""/>
       <w:lvlJc w:val="left"/>
       <w:pPr>
-        <w:ind w:left="4320" w:hanging="480"/>
-      </w:pPr>
+        <w:ind w:left="4320" w:hanging="360"/>
+      </w:pPr>
+      <w:rPr>
+        <w:rFonts w:ascii="Wingdings" w:hAnsi="Wingdings" w:cs="Wingdings" w:hint="default"/>
+      </w:rPr>
     </w:lvl>
     <w:lvl w:ilvl="6">
       <w:numFmt w:val="bullet"/>
-      <w:lvlText w:val="•"/>
+      <w:lvlText w:val=""/>
       <w:lvlJc w:val="left"/>
       <w:pPr>
-        <w:ind w:left="5040" w:hanging="480"/>
-      </w:pPr>
+        <w:ind w:left="5040" w:hanging="360"/>
+      </w:pPr>
+      <w:rPr>
+        <w:rFonts w:ascii="Symbol" w:hAnsi="Symbol" w:cs="Symbol" w:hint="default"/>
+      </w:rPr>
     </w:lvl>
     <w:lvl w:ilvl="7">
       <w:numFmt w:val="bullet"/>
-      <w:lvlText w:val="–"/>
+      <w:lvlText w:val="o"/>
       <w:lvlJc w:val="left"/>
       <w:pPr>
-        <w:ind w:left="5760" w:hanging="480"/>
-      </w:pPr>
+        <w:ind w:left="5760" w:hanging="360"/>
+      </w:pPr>
+      <w:rPr>
+        <w:rFonts w:ascii="Courier New" w:hAnsi="Courier New" w:cs="Courier New" w:hint="default"/>
+      </w:rPr>
     </w:lvl>
     <w:lvl w:ilvl="8">
       <w:numFmt w:val="bullet"/>
-      <w:lvlText w:val="•"/>
+      <w:lvlText w:val=""/>
       <w:lvlJc w:val="left"/>
       <w:pPr>
-        <w:ind w:left="6480" w:hanging="480"/>
-      </w:pPr>
+        <w:ind w:left="6480" w:hanging="360"/>
+      </w:pPr>
+      <w:rPr>
+        <w:rFonts w:ascii="Wingdings" w:hAnsi="Wingdings" w:cs="Wingdings" w:hint="default"/>
+      </w:rPr>
     </w:lvl>
   </w:abstractNum>
   <w:num w:numId="1000">
@@ -1795,10 +1722,10 @@
   <w:docDefaults>
     <w:rPrDefault>
       <w:rPr>
-        <w:rFonts w:asciiTheme="minorHAnsi" w:cstheme="minorBidi" w:eastAsiaTheme="minorHAnsi" w:hAnsiTheme="minorHAnsi"/>
+        <w:rFonts w:asciiTheme="minorHAnsi" w:cstheme="minorBidi" w:eastAsiaTheme="minorEastAsia" w:hAnsiTheme="minorHAnsi"/>
         <w:sz w:val="24"/>
         <w:szCs w:val="24"/>
-        <w:lang w:bidi="ar-SA" w:eastAsia="en-US" w:val="en-US"/>
+        <w:lang w:bidi="ar-SA" w:eastAsia="zh-CN" w:val="en-US"/>
       </w:rPr>
     </w:rPrDefault>
     <w:pPrDefault>
@@ -1816,10 +1743,10 @@
     <w:name w:val="Body Text"/>
     <w:basedOn w:val="Normal"/>
     <w:link w:val="BodyTextChar"/>
+    <w:qFormat/>
     <w:pPr>
       <w:spacing w:after="180" w:before="180"/>
     </w:pPr>
-    <w:qFormat/>
   </w:style>
   <w:style w:customStyle="1" w:styleId="FirstParagraph" w:type="paragraph">
     <w:name w:val="First Paragraph"/>
@@ -1839,57 +1766,94 @@
     <w:name w:val="Title"/>
     <w:basedOn w:val="Normal"/>
     <w:next w:val="BodyText"/>
+    <w:link w:val="TitleChar"/>
+    <w:uiPriority w:val="10"/>
     <w:qFormat/>
+    <w:rsid w:val="00A10FD9"/>
     <w:pPr>
-      <w:keepNext/>
-      <w:keepLines/>
-      <w:spacing w:after="240" w:before="480"/>
+      <w:spacing w:after="80" w:line="240" w:lineRule="auto"/>
+      <w:contextualSpacing/>
       <w:jc w:val="center"/>
     </w:pPr>
     <w:rPr>
       <w:rFonts w:asciiTheme="majorHAnsi" w:cstheme="majorBidi" w:eastAsiaTheme="majorEastAsia" w:hAnsiTheme="majorHAnsi"/>
-      <w:b/>
-      <w:bCs/>
-      <w:color w:themeColor="accent1" w:themeShade="B5" w:val="345A8A"/>
-      <w:sz w:val="36"/>
-      <w:szCs w:val="36"/>
+      <w:sz w:val="56"/>
+      <w:szCs w:val="56"/>
+    </w:rPr>
+  </w:style>
+  <w:style w:customStyle="1" w:styleId="TitleChar" w:type="character">
+    <w:name w:val="Title Char"/>
+    <w:basedOn w:val="DefaultParagraphFont"/>
+    <w:link w:val="Title"/>
+    <w:uiPriority w:val="10"/>
+    <w:rsid w:val="00A10FD9"/>
+    <w:rPr>
+      <w:rFonts w:asciiTheme="majorHAnsi" w:cstheme="majorBidi" w:eastAsiaTheme="majorEastAsia" w:hAnsiTheme="majorHAnsi"/>
+      <w:sz w:val="56"/>
+      <w:szCs w:val="56"/>
     </w:rPr>
   </w:style>
   <w:style w:styleId="Subtitle" w:type="paragraph">
     <w:name w:val="Subtitle"/>
+    <w:basedOn w:val="Title"/>
+    <w:next w:val="BodyText"/>
+    <w:link w:val="SubtitleChar"/>
+    <w:uiPriority w:val="11"/>
+    <w:qFormat/>
+    <w:rsid w:val="00A10FD9"/>
+    <w:pPr>
+      <w:numPr>
+        <w:ilvl w:val="1"/>
+      </w:numPr>
+    </w:pPr>
+    <w:rPr>
+      <w:rFonts w:cstheme="majorBidi" w:eastAsiaTheme="majorEastAsia"/>
+      <w:spacing w:val="15"/>
+      <w:sz w:val="28"/>
+      <w:szCs w:val="28"/>
+    </w:rPr>
+  </w:style>
+  <w:style w:customStyle="1" w:styleId="SubtitleChar" w:type="character">
+    <w:name w:val="Subtitle Char"/>
+    <w:basedOn w:val="DefaultParagraphFont"/>
+    <w:link w:val="Subtitle"/>
+    <w:uiPriority w:val="11"/>
+    <w:rsid w:val="00A10FD9"/>
+    <w:rPr>
+      <w:rFonts w:cstheme="majorBidi" w:eastAsiaTheme="majorEastAsia"/>
+      <w:color w:themeColor="text1" w:themeTint="A6" w:val="595959"/>
+      <w:spacing w:val="15"/>
+      <w:sz w:val="28"/>
+      <w:szCs w:val="28"/>
+    </w:rPr>
+  </w:style>
+  <w:style w:customStyle="1" w:styleId="Author" w:type="paragraph">
+    <w:name w:val="Author"/>
     <w:basedOn w:val="Title"/>
     <w:next w:val="BodyText"/>
     <w:qFormat/>
     <w:pPr>
       <w:keepNext/>
       <w:keepLines/>
-      <w:spacing w:after="240" w:before="240"/>
-      <w:jc w:val="center"/>
     </w:pPr>
     <w:rPr>
-      <w:sz w:val="30"/>
-      <w:szCs w:val="30"/>
-    </w:rPr>
-  </w:style>
-  <w:style w:customStyle="1" w:styleId="Author" w:type="paragraph">
-    <w:name w:val="Author"/>
+      <w:sz w:val="24"/>
+      <w:szCs w:val="24"/>
+    </w:rPr>
+  </w:style>
+  <w:style w:styleId="Date" w:type="paragraph">
+    <w:name w:val="Date"/>
+    <w:basedOn w:val="Title"/>
     <w:next w:val="BodyText"/>
     <w:qFormat/>
     <w:pPr>
       <w:keepNext/>
       <w:keepLines/>
-      <w:jc w:val="center"/>
     </w:pPr>
-  </w:style>
-  <w:style w:styleId="Date" w:type="paragraph">
-    <w:name w:val="Date"/>
-    <w:next w:val="BodyText"/>
-    <w:qFormat/>
-    <w:pPr>
-      <w:keepNext/>
-      <w:keepLines/>
-      <w:jc w:val="center"/>
-    </w:pPr>
+    <w:rPr>
+      <w:sz w:val="24"/>
+      <w:szCs w:val="24"/>
+    </w:rPr>
   </w:style>
   <w:style w:customStyle="1" w:styleId="AbstractTitle" w:type="paragraph">
     <w:name w:val="Abstract Title"/>
@@ -1899,15 +1863,13 @@
     <w:pPr>
       <w:keepNext/>
       <w:keepLines/>
+      <w:spacing w:after="0" w:before="300"/>
       <w:jc w:val="center"/>
-      <w:spacing w:after="0" w:before="300"/>
     </w:pPr>
     <w:rPr>
+      <w:b/>
       <w:sz w:val="20"/>
       <w:szCs w:val="20"/>
-      <w:b/>
-      <w:color w:val="345A8A"/>
-      &gt;
     </w:rPr>
   </w:style>
   <w:style w:customStyle="1" w:styleId="Abstract" w:type="paragraph">
@@ -1934,191 +1896,321 @@
     <w:rPr/>
   </w:style>
   <w:style w:styleId="Heading1" w:type="paragraph">
-    <w:name w:val="Heading 1"/>
+    <w:name w:val="heading 1"/>
     <w:basedOn w:val="Normal"/>
     <w:next w:val="BodyText"/>
+    <w:link w:val="Heading1Char"/>
     <w:uiPriority w:val="9"/>
     <w:qFormat/>
+    <w:rsid w:val="00A10FD9"/>
     <w:pPr>
       <w:keepNext/>
       <w:keepLines/>
-      <w:spacing w:after="0" w:before="480"/>
+      <w:spacing w:after="80" w:before="360"/>
       <w:outlineLvl w:val="0"/>
     </w:pPr>
     <w:rPr>
       <w:rFonts w:asciiTheme="majorHAnsi" w:cstheme="majorBidi" w:eastAsiaTheme="majorEastAsia" w:hAnsiTheme="majorHAnsi"/>
-      <w:b/>
-      <w:bCs/>
-      <w:color w:themeColor="accent1" w:val="4F81BD"/>
-      <w:sz w:val="32"/>
-      <w:szCs w:val="32"/>
+      <w:color w:themeColor="accent1" w:themeShade="BF" w:val="0F4761"/>
+      <w:sz w:val="40"/>
+      <w:szCs w:val="40"/>
     </w:rPr>
   </w:style>
   <w:style w:styleId="Heading2" w:type="paragraph">
-    <w:name w:val="Heading 2"/>
+    <w:name w:val="heading 2"/>
     <w:basedOn w:val="Normal"/>
     <w:next w:val="BodyText"/>
+    <w:link w:val="Heading2Char"/>
     <w:uiPriority w:val="9"/>
+    <w:semiHidden/>
     <w:unhideWhenUsed/>
     <w:qFormat/>
+    <w:rsid w:val="00A10FD9"/>
     <w:pPr>
       <w:keepNext/>
       <w:keepLines/>
-      <w:spacing w:after="0" w:before="200"/>
+      <w:spacing w:after="80" w:before="160"/>
       <w:outlineLvl w:val="1"/>
     </w:pPr>
     <w:rPr>
       <w:rFonts w:asciiTheme="majorHAnsi" w:cstheme="majorBidi" w:eastAsiaTheme="majorEastAsia" w:hAnsiTheme="majorHAnsi"/>
-      <w:b/>
-      <w:bCs/>
-      <w:color w:themeColor="accent1" w:val="4F81BD"/>
-      <w:sz w:val="28"/>
-      <w:szCs w:val="28"/>
+      <w:color w:themeColor="accent1" w:themeShade="BF" w:val="0F4761"/>
+      <w:sz w:val="32"/>
+      <w:szCs w:val="32"/>
     </w:rPr>
   </w:style>
   <w:style w:styleId="Heading3" w:type="paragraph">
-    <w:name w:val="Heading 3"/>
+    <w:name w:val="heading 3"/>
     <w:basedOn w:val="Normal"/>
     <w:next w:val="BodyText"/>
+    <w:link w:val="Heading3Char"/>
     <w:uiPriority w:val="9"/>
+    <w:semiHidden/>
     <w:unhideWhenUsed/>
     <w:qFormat/>
+    <w:rsid w:val="00A10FD9"/>
     <w:pPr>
       <w:keepNext/>
       <w:keepLines/>
-      <w:spacing w:after="0" w:before="200"/>
+      <w:spacing w:after="80" w:before="160"/>
       <w:outlineLvl w:val="2"/>
     </w:pPr>
     <w:rPr>
-      <w:rFonts w:asciiTheme="majorHAnsi" w:cstheme="majorBidi" w:eastAsiaTheme="majorEastAsia" w:hAnsiTheme="majorHAnsi"/>
-      <w:b/>
-      <w:bCs/>
-      <w:color w:themeColor="accent1" w:val="4F81BD"/>
-      <w:sz w:val="24"/>
-      <w:szCs w:val="24"/>
+      <w:rFonts w:cstheme="majorBidi" w:eastAsiaTheme="majorEastAsia"/>
+      <w:color w:themeColor="accent1" w:themeShade="BF" w:val="0F4761"/>
+      <w:sz w:val="28"/>
+      <w:szCs w:val="28"/>
     </w:rPr>
   </w:style>
   <w:style w:styleId="Heading4" w:type="paragraph">
-    <w:name w:val="Heading 4"/>
+    <w:name w:val="heading 4"/>
     <w:basedOn w:val="Normal"/>
     <w:next w:val="BodyText"/>
+    <w:link w:val="Heading4Char"/>
     <w:uiPriority w:val="9"/>
+    <w:semiHidden/>
     <w:unhideWhenUsed/>
     <w:qFormat/>
+    <w:rsid w:val="00A10FD9"/>
     <w:pPr>
       <w:keepNext/>
       <w:keepLines/>
-      <w:spacing w:after="0" w:before="200"/>
+      <w:spacing w:after="40" w:before="80"/>
       <w:outlineLvl w:val="3"/>
     </w:pPr>
     <w:rPr>
-      <w:rFonts w:asciiTheme="majorHAnsi" w:cstheme="majorBidi" w:eastAsiaTheme="majorEastAsia" w:hAnsiTheme="majorHAnsi"/>
+      <w:rFonts w:cstheme="majorBidi" w:eastAsiaTheme="majorEastAsia"/>
       <w:i/>
-      <w:bCs/>
-      <w:color w:themeColor="accent1" w:val="4F81BD"/>
-      <w:sz w:val="24"/>
-      <w:szCs w:val="24"/>
+      <w:iCs/>
+      <w:color w:themeColor="accent1" w:themeShade="BF" w:val="0F4761"/>
     </w:rPr>
   </w:style>
   <w:style w:styleId="Heading5" w:type="paragraph">
-    <w:name w:val="Heading 5"/>
+    <w:name w:val="heading 5"/>
     <w:basedOn w:val="Normal"/>
     <w:next w:val="BodyText"/>
+    <w:link w:val="Heading5Char"/>
     <w:uiPriority w:val="9"/>
+    <w:semiHidden/>
     <w:unhideWhenUsed/>
     <w:qFormat/>
+    <w:rsid w:val="00A10FD9"/>
     <w:pPr>
       <w:keepNext/>
       <w:keepLines/>
-      <w:spacing w:after="0" w:before="200"/>
+      <w:spacing w:after="40" w:before="80"/>
       <w:outlineLvl w:val="4"/>
     </w:pPr>
     <w:rPr>
-      <w:rFonts w:asciiTheme="majorHAnsi" w:cstheme="majorBidi" w:eastAsiaTheme="majorEastAsia" w:hAnsiTheme="majorHAnsi"/>
-      <w:iCs/>
-      <w:color w:themeColor="accent1" w:val="4F81BD"/>
-      <w:sz w:val="24"/>
-      <w:szCs w:val="24"/>
+      <w:rFonts w:cstheme="majorBidi" w:eastAsiaTheme="majorEastAsia"/>
+      <w:color w:themeColor="accent1" w:themeShade="BF" w:val="0F4761"/>
     </w:rPr>
   </w:style>
   <w:style w:styleId="Heading6" w:type="paragraph">
-    <w:name w:val="Heading 6"/>
+    <w:name w:val="heading 6"/>
     <w:basedOn w:val="Normal"/>
     <w:next w:val="BodyText"/>
+    <w:link w:val="Heading6Char"/>
     <w:uiPriority w:val="9"/>
+    <w:semiHidden/>
     <w:unhideWhenUsed/>
     <w:qFormat/>
+    <w:rsid w:val="00A10FD9"/>
     <w:pPr>
       <w:keepNext/>
       <w:keepLines/>
-      <w:spacing w:after="0" w:before="200"/>
+      <w:spacing w:after="0" w:before="40"/>
       <w:outlineLvl w:val="5"/>
     </w:pPr>
     <w:rPr>
-      <w:rFonts w:asciiTheme="majorHAnsi" w:cstheme="majorBidi" w:eastAsiaTheme="majorEastAsia" w:hAnsiTheme="majorHAnsi"/>
-      <w:color w:themeColor="accent1" w:val="4F81BD"/>
-      <w:sz w:val="24"/>
-      <w:szCs w:val="24"/>
+      <w:rFonts w:cstheme="majorBidi" w:eastAsiaTheme="majorEastAsia"/>
+      <w:i/>
+      <w:iCs/>
+      <w:color w:themeColor="text1" w:themeTint="A6" w:val="595959"/>
     </w:rPr>
   </w:style>
   <w:style w:styleId="Heading7" w:type="paragraph">
-    <w:name w:val="Heading 7"/>
+    <w:name w:val="heading 7"/>
     <w:basedOn w:val="Normal"/>
     <w:next w:val="BodyText"/>
+    <w:link w:val="Heading7Char"/>
     <w:uiPriority w:val="9"/>
+    <w:semiHidden/>
     <w:unhideWhenUsed/>
     <w:qFormat/>
+    <w:rsid w:val="00A10FD9"/>
     <w:pPr>
       <w:keepNext/>
       <w:keepLines/>
-      <w:spacing w:after="0" w:before="200"/>
+      <w:spacing w:after="0" w:before="40"/>
       <w:outlineLvl w:val="6"/>
     </w:pPr>
     <w:rPr>
-      <w:rFonts w:asciiTheme="majorHAnsi" w:cstheme="majorBidi" w:eastAsiaTheme="majorEastAsia" w:hAnsiTheme="majorHAnsi"/>
-      <w:color w:themeColor="accent1" w:val="4F81BD"/>
-      <w:sz w:val="24"/>
-      <w:szCs w:val="24"/>
+      <w:rFonts w:cstheme="majorBidi" w:eastAsiaTheme="majorEastAsia"/>
+      <w:color w:themeColor="text1" w:themeTint="A6" w:val="595959"/>
     </w:rPr>
   </w:style>
   <w:style w:styleId="Heading8" w:type="paragraph">
-    <w:name w:val="Heading 8"/>
+    <w:name w:val="heading 8"/>
     <w:basedOn w:val="Normal"/>
     <w:next w:val="BodyText"/>
+    <w:link w:val="Heading8Char"/>
     <w:uiPriority w:val="9"/>
+    <w:semiHidden/>
     <w:unhideWhenUsed/>
     <w:qFormat/>
+    <w:rsid w:val="00A10FD9"/>
     <w:pPr>
       <w:keepNext/>
       <w:keepLines/>
-      <w:spacing w:after="0" w:before="200"/>
+      <w:spacing w:after="0"/>
       <w:outlineLvl w:val="7"/>
     </w:pPr>
     <w:rPr>
-      <w:rFonts w:asciiTheme="majorHAnsi" w:cstheme="majorBidi" w:eastAsiaTheme="majorEastAsia" w:hAnsiTheme="majorHAnsi"/>
-      <w:color w:themeColor="accent1" w:val="4F81BD"/>
-      <w:sz w:val="24"/>
-      <w:szCs w:val="24"/>
+      <w:rFonts w:cstheme="majorBidi" w:eastAsiaTheme="majorEastAsia"/>
+      <w:i/>
+      <w:iCs/>
+      <w:color w:themeColor="text1" w:themeTint="D8" w:val="272727"/>
     </w:rPr>
   </w:style>
   <w:style w:styleId="Heading9" w:type="paragraph">
-    <w:name w:val="Heading 9"/>
+    <w:name w:val="heading 9"/>
     <w:basedOn w:val="Normal"/>
     <w:next w:val="BodyText"/>
+    <w:link w:val="Heading9Char"/>
     <w:uiPriority w:val="9"/>
+    <w:semiHidden/>
     <w:unhideWhenUsed/>
     <w:qFormat/>
+    <w:rsid w:val="00A10FD9"/>
     <w:pPr>
       <w:keepNext/>
       <w:keepLines/>
-      <w:spacing w:after="0" w:before="200"/>
+      <w:spacing w:after="0"/>
       <w:outlineLvl w:val="8"/>
     </w:pPr>
     <w:rPr>
+      <w:rFonts w:cstheme="majorBidi" w:eastAsiaTheme="majorEastAsia"/>
+      <w:color w:themeColor="text1" w:themeTint="D8" w:val="272727"/>
+    </w:rPr>
+  </w:style>
+  <w:style w:customStyle="1" w:styleId="Heading1Char" w:type="character">
+    <w:name w:val="Heading 1 Char"/>
+    <w:basedOn w:val="DefaultParagraphFont"/>
+    <w:link w:val="Heading1"/>
+    <w:uiPriority w:val="9"/>
+    <w:rsid w:val="00A10FD9"/>
+    <w:rPr>
       <w:rFonts w:asciiTheme="majorHAnsi" w:cstheme="majorBidi" w:eastAsiaTheme="majorEastAsia" w:hAnsiTheme="majorHAnsi"/>
-      <w:color w:themeColor="accent1" w:val="4F81BD"/>
-      <w:sz w:val="24"/>
-      <w:szCs w:val="24"/>
+      <w:color w:themeColor="accent1" w:themeShade="BF" w:val="0F4761"/>
+      <w:sz w:val="40"/>
+      <w:szCs w:val="40"/>
+    </w:rPr>
+  </w:style>
+  <w:style w:customStyle="1" w:styleId="Heading2Char" w:type="character">
+    <w:name w:val="Heading 2 Char"/>
+    <w:basedOn w:val="DefaultParagraphFont"/>
+    <w:link w:val="Heading2"/>
+    <w:uiPriority w:val="9"/>
+    <w:semiHidden/>
+    <w:rsid w:val="00A10FD9"/>
+    <w:rPr>
+      <w:rFonts w:asciiTheme="majorHAnsi" w:cstheme="majorBidi" w:eastAsiaTheme="majorEastAsia" w:hAnsiTheme="majorHAnsi"/>
+      <w:color w:themeColor="accent1" w:themeShade="BF" w:val="0F4761"/>
+      <w:sz w:val="32"/>
+      <w:szCs w:val="32"/>
+    </w:rPr>
+  </w:style>
+  <w:style w:customStyle="1" w:styleId="Heading3Char" w:type="character">
+    <w:name w:val="Heading 3 Char"/>
+    <w:basedOn w:val="DefaultParagraphFont"/>
+    <w:link w:val="Heading3"/>
+    <w:uiPriority w:val="9"/>
+    <w:semiHidden/>
+    <w:rsid w:val="00A10FD9"/>
+    <w:rPr>
+      <w:rFonts w:cstheme="majorBidi" w:eastAsiaTheme="majorEastAsia"/>
+      <w:color w:themeColor="accent1" w:themeShade="BF" w:val="0F4761"/>
+      <w:sz w:val="28"/>
+      <w:szCs w:val="28"/>
+    </w:rPr>
+  </w:style>
+  <w:style w:customStyle="1" w:styleId="Heading4Char" w:type="character">
+    <w:name w:val="Heading 4 Char"/>
+    <w:basedOn w:val="DefaultParagraphFont"/>
+    <w:link w:val="Heading4"/>
+    <w:uiPriority w:val="9"/>
+    <w:semiHidden/>
+    <w:rsid w:val="00A10FD9"/>
+    <w:rPr>
+      <w:rFonts w:cstheme="majorBidi" w:eastAsiaTheme="majorEastAsia"/>
+      <w:i/>
+      <w:iCs/>
+      <w:color w:themeColor="accent1" w:themeShade="BF" w:val="0F4761"/>
+    </w:rPr>
+  </w:style>
+  <w:style w:customStyle="1" w:styleId="Heading5Char" w:type="character">
+    <w:name w:val="Heading 5 Char"/>
+    <w:basedOn w:val="DefaultParagraphFont"/>
+    <w:link w:val="Heading5"/>
+    <w:uiPriority w:val="9"/>
+    <w:semiHidden/>
+    <w:rsid w:val="00A10FD9"/>
+    <w:rPr>
+      <w:rFonts w:cstheme="majorBidi" w:eastAsiaTheme="majorEastAsia"/>
+      <w:color w:themeColor="accent1" w:themeShade="BF" w:val="0F4761"/>
+    </w:rPr>
+  </w:style>
+  <w:style w:customStyle="1" w:styleId="Heading6Char" w:type="character">
+    <w:name w:val="Heading 6 Char"/>
+    <w:basedOn w:val="DefaultParagraphFont"/>
+    <w:link w:val="Heading6"/>
+    <w:uiPriority w:val="9"/>
+    <w:semiHidden/>
+    <w:rsid w:val="00A10FD9"/>
+    <w:rPr>
+      <w:rFonts w:cstheme="majorBidi" w:eastAsiaTheme="majorEastAsia"/>
+      <w:i/>
+      <w:iCs/>
+      <w:color w:themeColor="text1" w:themeTint="A6" w:val="595959"/>
+    </w:rPr>
+  </w:style>
+  <w:style w:customStyle="1" w:styleId="Heading7Char" w:type="character">
+    <w:name w:val="Heading 7 Char"/>
+    <w:basedOn w:val="DefaultParagraphFont"/>
+    <w:link w:val="Heading7"/>
+    <w:uiPriority w:val="9"/>
+    <w:semiHidden/>
+    <w:rsid w:val="00A10FD9"/>
+    <w:rPr>
+      <w:rFonts w:cstheme="majorBidi" w:eastAsiaTheme="majorEastAsia"/>
+      <w:color w:themeColor="text1" w:themeTint="A6" w:val="595959"/>
+    </w:rPr>
+  </w:style>
+  <w:style w:customStyle="1" w:styleId="Heading8Char" w:type="character">
+    <w:name w:val="Heading 8 Char"/>
+    <w:basedOn w:val="DefaultParagraphFont"/>
+    <w:link w:val="Heading8"/>
+    <w:uiPriority w:val="9"/>
+    <w:semiHidden/>
+    <w:rsid w:val="00A10FD9"/>
+    <w:rPr>
+      <w:rFonts w:cstheme="majorBidi" w:eastAsiaTheme="majorEastAsia"/>
+      <w:i/>
+      <w:iCs/>
+      <w:color w:themeColor="text1" w:themeTint="D8" w:val="272727"/>
+    </w:rPr>
+  </w:style>
+  <w:style w:customStyle="1" w:styleId="Heading9Char" w:type="character">
+    <w:name w:val="Heading 9 Char"/>
+    <w:basedOn w:val="DefaultParagraphFont"/>
+    <w:link w:val="Heading9"/>
+    <w:uiPriority w:val="9"/>
+    <w:semiHidden/>
+    <w:rsid w:val="00A10FD9"/>
+    <w:rPr>
+      <w:rFonts w:cstheme="majorBidi" w:eastAsiaTheme="majorEastAsia"/>
+      <w:color w:themeColor="text1" w:themeTint="D8" w:val="272727"/>
     </w:rPr>
   </w:style>
   <w:style w:styleId="BlockText" w:type="paragraph">
@@ -2140,6 +2232,18 @@
     <w:uiPriority w:val="9"/>
     <w:unhideWhenUsed/>
     <w:qFormat/>
+  </w:style>
+  <w:style w:styleId="FootnoteBlockText" w:type="paragraph">
+    <w:name w:val="Footnote Block Text"/>
+    <w:basedOn w:val="FootnoteText"/>
+    <w:next w:val="FootnoteText"/>
+    <w:uiPriority w:val="9"/>
+    <w:unhideWhenUsed/>
+    <w:qFormat/>
+    <w:pPr>
+      <w:spacing w:after="100" w:before="100"/>
+      <w:ind w:firstLine="0" w:left="480" w:right="480"/>
+    </w:pPr>
   </w:style>
   <w:style w:default="1" w:styleId="DefaultParagraphFont" w:type="character">
     <w:name w:val="Default Paragraph Font"/>
@@ -2162,18 +2266,11 @@
       </w:tblCellMar>
     </w:tblPr>
     <w:tblStylePr w:type="firstRow">
-      <w:tblPr>
-        <w:jc w:val="left"/>
-        <w:tblInd w:type="dxa" w:w="0"/>
-      </w:tblPr>
-      <w:trPr>
-        <w:jc w:val="left"/>
-      </w:trPr>
       <w:tcPr>
-        <w:vAlign w:val="bottom"/>
         <w:tcBorders>
           <w:bottom w:val="single"/>
         </w:tcBorders>
+        <w:vAlign w:val="bottom"/>
       </w:tcPr>
     </w:tblStylePr>
   </w:style>
@@ -2288,8 +2385,8 @@
     <w:name w:val="KeywordTok"/>
     <w:basedOn w:val="VerbatimChar"/>
     <w:rPr>
+      <w:b/>
       <w:color w:val="007020"/>
-      <w:b/>
     </w:rPr>
   </w:style>
   <w:style w:type="character" w:customStyle="1" w:styleId="DataTypeTok">
@@ -2366,42 +2463,42 @@
     <w:name w:val="ImportTok"/>
     <w:basedOn w:val="VerbatimChar"/>
     <w:rPr>
+      <w:b/>
       <w:color w:val="008000"/>
-      <w:b/>
     </w:rPr>
   </w:style>
   <w:style w:type="character" w:customStyle="1" w:styleId="CommentTok">
     <w:name w:val="CommentTok"/>
     <w:basedOn w:val="VerbatimChar"/>
     <w:rPr>
+      <w:i/>
       <w:color w:val="60a0b0"/>
-      <w:i/>
     </w:rPr>
   </w:style>
   <w:style w:type="character" w:customStyle="1" w:styleId="DocumentationTok">
     <w:name w:val="DocumentationTok"/>
     <w:basedOn w:val="VerbatimChar"/>
     <w:rPr>
+      <w:i/>
       <w:color w:val="ba2121"/>
-      <w:i/>
     </w:rPr>
   </w:style>
   <w:style w:type="character" w:customStyle="1" w:styleId="AnnotationTok">
     <w:name w:val="AnnotationTok"/>
     <w:basedOn w:val="VerbatimChar"/>
     <w:rPr>
-      <w:color w:val="60a0b0"/>
       <w:b/>
       <w:i/>
+      <w:color w:val="60a0b0"/>
     </w:rPr>
   </w:style>
   <w:style w:type="character" w:customStyle="1" w:styleId="CommentVarTok">
     <w:name w:val="CommentVarTok"/>
     <w:basedOn w:val="VerbatimChar"/>
     <w:rPr>
-      <w:color w:val="60a0b0"/>
       <w:b/>
       <w:i/>
+      <w:color w:val="60a0b0"/>
     </w:rPr>
   </w:style>
   <w:style w:type="character" w:customStyle="1" w:styleId="OtherTok">
@@ -2429,8 +2526,8 @@
     <w:name w:val="ControlFlowTok"/>
     <w:basedOn w:val="VerbatimChar"/>
     <w:rPr>
+      <w:b/>
       <w:color w:val="007020"/>
-      <w:b/>
     </w:rPr>
   </w:style>
   <w:style w:type="character" w:customStyle="1" w:styleId="OperatorTok">
@@ -2475,34 +2572,34 @@
     <w:name w:val="InformationTok"/>
     <w:basedOn w:val="VerbatimChar"/>
     <w:rPr>
-      <w:color w:val="60a0b0"/>
       <w:b/>
       <w:i/>
+      <w:color w:val="60a0b0"/>
     </w:rPr>
   </w:style>
   <w:style w:type="character" w:customStyle="1" w:styleId="WarningTok">
     <w:name w:val="WarningTok"/>
     <w:basedOn w:val="VerbatimChar"/>
     <w:rPr>
-      <w:color w:val="60a0b0"/>
       <w:b/>
       <w:i/>
+      <w:color w:val="60a0b0"/>
     </w:rPr>
   </w:style>
   <w:style w:type="character" w:customStyle="1" w:styleId="AlertTok">
     <w:name w:val="AlertTok"/>
     <w:basedOn w:val="VerbatimChar"/>
     <w:rPr>
+      <w:b/>
       <w:color w:val="ff0000"/>
-      <w:b/>
     </w:rPr>
   </w:style>
   <w:style w:type="character" w:customStyle="1" w:styleId="ErrorTok">
     <w:name w:val="ErrorTok"/>
     <w:basedOn w:val="VerbatimChar"/>
     <w:rPr>
+      <w:b/>
       <w:color w:val="ff0000"/>
-      <w:b/>
     </w:rPr>
   </w:style>
   <w:style w:type="character" w:customStyle="1" w:styleId="NormalTok">
@@ -2524,44 +2621,44 @@
         <a:sysClr val="window" lastClr="FFFFFF"/>
       </a:lt1>
       <a:dk2>
-        <a:srgbClr val="1F497D"/>
+        <a:srgbClr val="0E2841"/>
       </a:dk2>
       <a:lt2>
-        <a:srgbClr val="EEECE1"/>
+        <a:srgbClr val="E8E8E8"/>
       </a:lt2>
       <a:accent1>
-        <a:srgbClr val="4F81BD"/>
+        <a:srgbClr val="156082"/>
       </a:accent1>
       <a:accent2>
-        <a:srgbClr val="C0504D"/>
+        <a:srgbClr val="E97132"/>
       </a:accent2>
       <a:accent3>
-        <a:srgbClr val="9BBB59"/>
+        <a:srgbClr val="196B24"/>
       </a:accent3>
       <a:accent4>
-        <a:srgbClr val="8064A2"/>
+        <a:srgbClr val="0F9ED5"/>
       </a:accent4>
       <a:accent5>
-        <a:srgbClr val="4BACC6"/>
+        <a:srgbClr val="A02B93"/>
       </a:accent5>
       <a:accent6>
-        <a:srgbClr val="F79646"/>
+        <a:srgbClr val="4EA72E"/>
       </a:accent6>
       <a:hlink>
-        <a:srgbClr val="0000FF"/>
+        <a:srgbClr val="467886"/>
       </a:hlink>
       <a:folHlink>
-        <a:srgbClr val="800080"/>
+        <a:srgbClr val="96607D"/>
       </a:folHlink>
     </a:clrScheme>
     <a:fontScheme name="Office">
       <a:majorFont>
-        <a:latin typeface="Calibri"/>
+        <a:latin typeface="Aptos Display" panose="02110004020202020204"/>
         <a:ea typeface=""/>
         <a:cs typeface=""/>
-        <a:font script="Jpan" typeface="ＭＳ ゴシック"/>
+        <a:font script="Jpan" typeface="游ゴシック Light"/>
         <a:font script="Hang" typeface="맑은 고딕"/>
-        <a:font script="Hans" typeface="宋体"/>
+        <a:font script="Hans" typeface="等线 Light"/>
         <a:font script="Hant" typeface="新細明體"/>
         <a:font script="Arab" typeface="Times New Roman"/>
         <a:font script="Hebr" typeface="Times New Roman"/>
@@ -2588,14 +2685,32 @@
         <a:font script="Mong" typeface="Mongolian Baiti"/>
         <a:font script="Viet" typeface="Times New Roman"/>
         <a:font script="Uigh" typeface="Microsoft Uighur"/>
+        <a:font script="Geor" typeface="Sylfaen"/>
+        <a:font script="Armn" typeface="Arial"/>
+        <a:font script="Bugi" typeface="Leelawadee UI"/>
+        <a:font script="Bopo" typeface="Microsoft JhengHei"/>
+        <a:font script="Java" typeface="Javanese Text"/>
+        <a:font script="Lisu" typeface="Segoe UI"/>
+        <a:font script="Mymr" typeface="Myanmar Text"/>
+        <a:font script="Nkoo" typeface="Ebrima"/>
+        <a:font script="Olck" typeface="Nirmala UI"/>
+        <a:font script="Osma" typeface="Ebrima"/>
+        <a:font script="Phag" typeface="Phagspa"/>
+        <a:font script="Syrn" typeface="Estrangelo Edessa"/>
+        <a:font script="Syrj" typeface="Estrangelo Edessa"/>
+        <a:font script="Syre" typeface="Estrangelo Edessa"/>
+        <a:font script="Sora" typeface="Nirmala UI"/>
+        <a:font script="Tale" typeface="Microsoft Tai Le"/>
+        <a:font script="Talu" typeface="Microsoft New Tai Lue"/>
+        <a:font script="Tfng" typeface="Ebrima"/>
       </a:majorFont>
       <a:minorFont>
-        <a:latin typeface="Cambria"/>
+        <a:latin typeface="Aptos" panose="02110004020202020204"/>
         <a:ea typeface=""/>
         <a:cs typeface=""/>
-        <a:font script="Jpan" typeface="ＭＳ 明朝"/>
+        <a:font script="Jpan" typeface="游明朝"/>
         <a:font script="Hang" typeface="맑은 고딕"/>
-        <a:font script="Hans" typeface="宋体"/>
+        <a:font script="Hans" typeface="等线"/>
         <a:font script="Hant" typeface="新細明體"/>
         <a:font script="Arab" typeface="Arial"/>
         <a:font script="Hebr" typeface="Arial"/>
@@ -2622,6 +2737,24 @@
         <a:font script="Mong" typeface="Mongolian Baiti"/>
         <a:font script="Viet" typeface="Arial"/>
         <a:font script="Uigh" typeface="Microsoft Uighur"/>
+        <a:font script="Geor" typeface="Sylfaen"/>
+        <a:font script="Armn" typeface="Arial"/>
+        <a:font script="Bugi" typeface="Leelawadee UI"/>
+        <a:font script="Bopo" typeface="Microsoft JhengHei"/>
+        <a:font script="Java" typeface="Javanese Text"/>
+        <a:font script="Lisu" typeface="Segoe UI"/>
+        <a:font script="Mymr" typeface="Myanmar Text"/>
+        <a:font script="Nkoo" typeface="Ebrima"/>
+        <a:font script="Olck" typeface="Nirmala UI"/>
+        <a:font script="Osma" typeface="Ebrima"/>
+        <a:font script="Phag" typeface="Phagspa"/>
+        <a:font script="Syrn" typeface="Estrangelo Edessa"/>
+        <a:font script="Syrj" typeface="Estrangelo Edessa"/>
+        <a:font script="Syre" typeface="Estrangelo Edessa"/>
+        <a:font script="Sora" typeface="Nirmala UI"/>
+        <a:font script="Tale" typeface="Microsoft Tai Le"/>
+        <a:font script="Talu" typeface="Microsoft New Tai Lue"/>
+        <a:font script="Tfng" typeface="Ebrima"/>
       </a:minorFont>
     </a:fontScheme>
     <a:fmtScheme name="Office">
@@ -2633,200 +2766,141 @@
           <a:gsLst>
             <a:gs pos="0">
               <a:schemeClr val="phClr">
-                <a:tint val="50000"/>
-                <a:satMod val="300000"/>
+                <a:lumMod val="110000"/>
+                <a:satMod val="105000"/>
+                <a:tint val="67000"/>
               </a:schemeClr>
             </a:gs>
-            <a:gs pos="35000">
+            <a:gs pos="50000">
               <a:schemeClr val="phClr">
-                <a:tint val="37000"/>
-                <a:satMod val="300000"/>
+                <a:lumMod val="105000"/>
+                <a:satMod val="103000"/>
+                <a:tint val="73000"/>
               </a:schemeClr>
             </a:gs>
             <a:gs pos="100000">
               <a:schemeClr val="phClr">
-                <a:tint val="15000"/>
-                <a:satMod val="350000"/>
+                <a:lumMod val="105000"/>
+                <a:satMod val="109000"/>
+                <a:tint val="81000"/>
               </a:schemeClr>
             </a:gs>
           </a:gsLst>
-          <a:lin ang="16200000" scaled="1"/>
+          <a:lin ang="5400000" scaled="0"/>
         </a:gradFill>
         <a:gradFill rotWithShape="1">
           <a:gsLst>
             <a:gs pos="0">
               <a:schemeClr val="phClr">
-                <a:tint val="100000"/>
+                <a:satMod val="103000"/>
+                <a:lumMod val="102000"/>
+                <a:tint val="94000"/>
+              </a:schemeClr>
+            </a:gs>
+            <a:gs pos="50000">
+              <a:schemeClr val="phClr">
+                <a:satMod val="110000"/>
+                <a:lumMod val="100000"/>
                 <a:shade val="100000"/>
-                <a:satMod val="130000"/>
               </a:schemeClr>
             </a:gs>
             <a:gs pos="100000">
               <a:schemeClr val="phClr">
-                <a:tint val="50000"/>
-                <a:shade val="100000"/>
-                <a:satMod val="350000"/>
+                <a:lumMod val="99000"/>
+                <a:satMod val="120000"/>
+                <a:shade val="78000"/>
               </a:schemeClr>
             </a:gs>
           </a:gsLst>
-          <a:lin ang="16200000" scaled="0"/>
+          <a:lin ang="5400000" scaled="0"/>
         </a:gradFill>
       </a:fillStyleLst>
       <a:lnStyleLst>
-        <a:ln w="9525" cap="flat" cmpd="sng" algn="ctr">
-          <a:solidFill>
-            <a:schemeClr val="phClr">
-              <a:shade val="95000"/>
-              <a:satMod val="105000"/>
-            </a:schemeClr>
-          </a:solidFill>
-          <a:prstDash val="solid"/>
-        </a:ln>
-        <a:ln w="25400" cap="flat" cmpd="sng" algn="ctr">
+        <a:ln w="6350" cap="flat" cmpd="sng" algn="ctr">
           <a:solidFill>
             <a:schemeClr val="phClr"/>
           </a:solidFill>
           <a:prstDash val="solid"/>
+          <a:miter lim="800000"/>
         </a:ln>
-        <a:ln w="38100" cap="flat" cmpd="sng" algn="ctr">
+        <a:ln w="12700" cap="flat" cmpd="sng" algn="ctr">
           <a:solidFill>
             <a:schemeClr val="phClr"/>
           </a:solidFill>
           <a:prstDash val="solid"/>
+          <a:miter lim="800000"/>
+        </a:ln>
+        <a:ln w="19050" cap="flat" cmpd="sng" algn="ctr">
+          <a:solidFill>
+            <a:schemeClr val="phClr"/>
+          </a:solidFill>
+          <a:prstDash val="solid"/>
+          <a:miter lim="800000"/>
         </a:ln>
       </a:lnStyleLst>
       <a:effectStyleLst>
         <a:effectStyle>
+          <a:effectLst/>
+        </a:effectStyle>
+        <a:effectStyle>
+          <a:effectLst/>
+        </a:effectStyle>
+        <a:effectStyle>
           <a:effectLst>
-            <a:outerShdw blurRad="40000" dist="20000" dir="5400000" rotWithShape="0">
+            <a:outerShdw blurRad="57150" dist="19050" dir="5400000" algn="ctr" rotWithShape="0">
               <a:srgbClr val="000000">
-                <a:alpha val="38000"/>
+                <a:alpha val="63000"/>
               </a:srgbClr>
             </a:outerShdw>
           </a:effectLst>
-        </a:effectStyle>
-        <a:effectStyle>
-          <a:effectLst>
-            <a:outerShdw blurRad="40000" dist="23000" dir="5400000" rotWithShape="0">
-              <a:srgbClr val="000000">
-                <a:alpha val="35000"/>
-              </a:srgbClr>
-            </a:outerShdw>
-          </a:effectLst>
-        </a:effectStyle>
-        <a:effectStyle>
-          <a:effectLst>
-            <a:outerShdw blurRad="40000" dist="23000" dir="5400000" rotWithShape="0">
-              <a:srgbClr val="000000">
-                <a:alpha val="35000"/>
-              </a:srgbClr>
-            </a:outerShdw>
-          </a:effectLst>
-          <a:scene3d>
-            <a:camera prst="orthographicFront">
-              <a:rot lat="0" lon="0" rev="0"/>
-            </a:camera>
-            <a:lightRig rig="threePt" dir="t">
-              <a:rot lat="0" lon="0" rev="1200000"/>
-            </a:lightRig>
-          </a:scene3d>
-          <a:sp3d>
-            <a:bevelT w="63500" h="25400"/>
-          </a:sp3d>
         </a:effectStyle>
       </a:effectStyleLst>
       <a:bgFillStyleLst>
         <a:solidFill>
           <a:schemeClr val="phClr"/>
         </a:solidFill>
+        <a:solidFill>
+          <a:schemeClr val="phClr">
+            <a:tint val="95000"/>
+            <a:satMod val="170000"/>
+          </a:schemeClr>
+        </a:solidFill>
         <a:gradFill rotWithShape="1">
           <a:gsLst>
             <a:gs pos="0">
               <a:schemeClr val="phClr">
-                <a:tint val="40000"/>
-                <a:satMod val="350000"/>
+                <a:tint val="93000"/>
+                <a:satMod val="150000"/>
+                <a:shade val="98000"/>
+                <a:lumMod val="102000"/>
               </a:schemeClr>
             </a:gs>
-            <a:gs pos="40000">
+            <a:gs pos="50000">
               <a:schemeClr val="phClr">
-                <a:tint val="45000"/>
-                <a:shade val="99000"/>
-                <a:satMod val="350000"/>
+                <a:tint val="98000"/>
+                <a:satMod val="130000"/>
+                <a:shade val="90000"/>
+                <a:lumMod val="103000"/>
               </a:schemeClr>
             </a:gs>
             <a:gs pos="100000">
               <a:schemeClr val="phClr">
-                <a:shade val="20000"/>
-                <a:satMod val="255000"/>
+                <a:shade val="63000"/>
+                <a:satMod val="120000"/>
               </a:schemeClr>
             </a:gs>
           </a:gsLst>
-          <a:path path="circle">
-            <a:fillToRect l="50000" t="-80000" r="50000" b="180000"/>
-          </a:path>
-        </a:gradFill>
-        <a:gradFill rotWithShape="1">
-          <a:gsLst>
-            <a:gs pos="0">
-              <a:schemeClr val="phClr">
-                <a:tint val="80000"/>
-                <a:satMod val="300000"/>
-              </a:schemeClr>
-            </a:gs>
-            <a:gs pos="100000">
-              <a:schemeClr val="phClr">
-                <a:shade val="30000"/>
-                <a:satMod val="200000"/>
-              </a:schemeClr>
-            </a:gs>
-          </a:gsLst>
-          <a:path path="circle">
-            <a:fillToRect l="50000" t="50000" r="50000" b="50000"/>
-          </a:path>
+          <a:lin ang="5400000" scaled="0"/>
         </a:gradFill>
       </a:bgFillStyleLst>
     </a:fmtScheme>
   </a:themeElements>
-  <a:objectDefaults>
-    <a:spDef>
-      <a:spPr/>
-      <a:bodyPr/>
-      <a:lstStyle/>
-      <a:style>
-        <a:lnRef idx="1">
-          <a:schemeClr val="accent1"/>
-        </a:lnRef>
-        <a:fillRef idx="3">
-          <a:schemeClr val="accent1"/>
-        </a:fillRef>
-        <a:effectRef idx="2">
-          <a:schemeClr val="accent1"/>
-        </a:effectRef>
-        <a:fontRef idx="minor">
-          <a:schemeClr val="lt1"/>
-        </a:fontRef>
-      </a:style>
-    </a:spDef>
-    <a:lnDef>
-      <a:spPr/>
-      <a:bodyPr/>
-      <a:lstStyle/>
-      <a:style>
-        <a:lnRef idx="2">
-          <a:schemeClr val="accent1"/>
-        </a:lnRef>
-        <a:fillRef idx="0">
-          <a:schemeClr val="accent1"/>
-        </a:fillRef>
-        <a:effectRef idx="1">
-          <a:schemeClr val="accent1"/>
-        </a:effectRef>
-        <a:fontRef idx="minor">
-          <a:schemeClr val="tx1"/>
-        </a:fontRef>
-      </a:style>
-    </a:lnDef>
-  </a:objectDefaults>
+  <a:objectDefaults/>
   <a:extraClrSchemeLst/>
+  <a:extLst>
+    <a:ext uri="{05A4C25C-085E-4340-85A3-A5531E510DB2}">
+      <thm15:themeFamily xmlns:thm15="http://schemas.microsoft.com/office/thememl/2012/main" name="Office Theme" id="{2E142A2C-CD16-42D6-873A-C26D2A0506FA}" vid="{1BDDFF52-6CD6-40A5-AB3C-68EB2F1E4D0A}"/>
+    </a:ext>
+  </a:extLst>
 </a:theme>
 </file>
</xml_diff>